<commit_message>
Improve PCA audit UI, reports layout, and record flexibility.
Add GSDC logo to header, persistent comma-formatted amount inputs, and PCF Tally summary cleanup. Rebuild Reports preview and exports to match the audit report template. Make PCA category optional and add N/A IR status support.

Co-authored-by: Cursor <cursoragent@cursor.com>
</commit_message>
<xml_diff>
--- a/PETTY CASH FUND AUDIT REPORT (Template).docx
+++ b/PETTY CASH FUND AUDIT REPORT (Template).docx
@@ -129,6 +129,27 @@
           <w:b/>
           <w:bCs/>
         </w:rPr>
+        <w:t xml:space="preserve"> (</w:t>
+      </w:r>
+      <w:r>
+        <w:rPr>
+          <w:b/>
+          <w:bCs/>
+        </w:rPr>
+        <w:t xml:space="preserve">Audit date; </w:t>
+      </w:r>
+      <w:r>
+        <w:rPr>
+          <w:b/>
+          <w:bCs/>
+        </w:rPr>
+        <w:t>BOLD font)</w:t>
+      </w:r>
+      <w:r>
+        <w:rPr>
+          <w:b/>
+          <w:bCs/>
+        </w:rPr>
         <w:t>]</w:t>
       </w:r>
       <w:r>
@@ -292,271 +313,6 @@
       </w:pPr>
     </w:p>
     <w:p>
-      <w:pPr>
-        <w:rPr>
-          <w:b/>
-          <w:bCs/>
-        </w:rPr>
-      </w:pPr>
-      <w:r>
-        <w:rPr>
-          <w:b/>
-          <w:bCs/>
-        </w:rPr>
-        <w:t xml:space="preserve">4. SUMMARY OF </w:t>
-      </w:r>
-      <w:r>
-        <w:rPr>
-          <w:b/>
-          <w:bCs/>
-        </w:rPr>
-        <w:t>FUND AUDIT</w:t>
-      </w:r>
-    </w:p>
-    <w:tbl>
-      <w:tblPr>
-        <w:tblW w:w="0" w:type="auto"/>
-        <w:tblCellSpacing w:w="15" w:type="dxa"/>
-        <w:tblCellMar>
-          <w:top w:w="15" w:type="dxa"/>
-          <w:left w:w="15" w:type="dxa"/>
-          <w:bottom w:w="15" w:type="dxa"/>
-          <w:right w:w="15" w:type="dxa"/>
-        </w:tblCellMar>
-        <w:tblLook w:val="04A0" w:firstRow="1" w:lastRow="0" w:firstColumn="1" w:lastColumn="0" w:noHBand="0" w:noVBand="1"/>
-      </w:tblPr>
-      <w:tblGrid>
-        <w:gridCol w:w="1964"/>
-        <w:gridCol w:w="2583"/>
-      </w:tblGrid>
-      <w:tr>
-        <w:trPr>
-          <w:tblHeader/>
-          <w:tblCellSpacing w:w="15" w:type="dxa"/>
-        </w:trPr>
-        <w:tc>
-          <w:tcPr>
-            <w:tcW w:w="1919" w:type="dxa"/>
-            <w:vAlign w:val="center"/>
-            <w:hideMark/>
-          </w:tcPr>
-          <w:p>
-            <w:pPr>
-              <w:rPr>
-                <w:b/>
-                <w:bCs/>
-              </w:rPr>
-            </w:pPr>
-            <w:r>
-              <w:rPr>
-                <w:b/>
-                <w:bCs/>
-              </w:rPr>
-              <w:t>Description</w:t>
-            </w:r>
-          </w:p>
-        </w:tc>
-        <w:tc>
-          <w:tcPr>
-            <w:tcW w:w="0" w:type="auto"/>
-            <w:vAlign w:val="center"/>
-            <w:hideMark/>
-          </w:tcPr>
-          <w:p>
-            <w:pPr>
-              <w:rPr>
-                <w:b/>
-                <w:bCs/>
-              </w:rPr>
-            </w:pPr>
-            <w:r>
-              <w:rPr>
-                <w:b/>
-                <w:bCs/>
-              </w:rPr>
-              <w:t>Amount (PHP)</w:t>
-            </w:r>
-          </w:p>
-        </w:tc>
-      </w:tr>
-      <w:tr>
-        <w:trPr>
-          <w:tblCellSpacing w:w="15" w:type="dxa"/>
-        </w:trPr>
-        <w:tc>
-          <w:tcPr>
-            <w:tcW w:w="1919" w:type="dxa"/>
-            <w:vAlign w:val="center"/>
-            <w:hideMark/>
-          </w:tcPr>
-          <w:p>
-            <w:r>
-              <w:t>Revolving Fund</w:t>
-            </w:r>
-          </w:p>
-          <w:p/>
-        </w:tc>
-        <w:tc>
-          <w:tcPr>
-            <w:tcW w:w="0" w:type="auto"/>
-            <w:vAlign w:val="center"/>
-            <w:hideMark/>
-          </w:tcPr>
-          <w:p>
-            <w:pPr>
-              <w:rPr>
-                <w:b/>
-                <w:bCs/>
-              </w:rPr>
-            </w:pPr>
-            <w:r>
-              <w:rPr>
-                <w:b/>
-                <w:bCs/>
-              </w:rPr>
-              <w:t>[AMOUNT]</w:t>
-            </w:r>
-          </w:p>
-          <w:p>
-            <w:pPr>
-              <w:rPr>
-                <w:b/>
-                <w:bCs/>
-              </w:rPr>
-            </w:pPr>
-          </w:p>
-        </w:tc>
-      </w:tr>
-      <w:tr>
-        <w:trPr>
-          <w:tblCellSpacing w:w="15" w:type="dxa"/>
-        </w:trPr>
-        <w:tc>
-          <w:tcPr>
-            <w:tcW w:w="1919" w:type="dxa"/>
-            <w:vAlign w:val="center"/>
-            <w:hideMark/>
-          </w:tcPr>
-          <w:p>
-            <w:pPr>
-              <w:spacing w:after="0"/>
-            </w:pPr>
-            <w:r>
-              <w:t>Total Liquidated</w:t>
-            </w:r>
-          </w:p>
-        </w:tc>
-        <w:tc>
-          <w:tcPr>
-            <w:tcW w:w="0" w:type="auto"/>
-            <w:vAlign w:val="center"/>
-          </w:tcPr>
-          <w:p>
-            <w:pPr>
-              <w:spacing w:after="0"/>
-              <w:rPr>
-                <w:b/>
-                <w:bCs/>
-              </w:rPr>
-            </w:pPr>
-            <w:r>
-              <w:rPr>
-                <w:b/>
-                <w:bCs/>
-              </w:rPr>
-              <w:t>[AMOUNT BREAKDOWN]</w:t>
-            </w:r>
-          </w:p>
-        </w:tc>
-      </w:tr>
-      <w:tr>
-        <w:trPr>
-          <w:tblCellSpacing w:w="15" w:type="dxa"/>
-        </w:trPr>
-        <w:tc>
-          <w:tcPr>
-            <w:tcW w:w="1919" w:type="dxa"/>
-            <w:vAlign w:val="center"/>
-            <w:hideMark/>
-          </w:tcPr>
-          <w:p>
-            <w:r>
-              <w:t>Total Unliquidated</w:t>
-            </w:r>
-          </w:p>
-        </w:tc>
-        <w:tc>
-          <w:tcPr>
-            <w:tcW w:w="0" w:type="auto"/>
-            <w:vAlign w:val="center"/>
-            <w:hideMark/>
-          </w:tcPr>
-          <w:p>
-            <w:pPr>
-              <w:rPr>
-                <w:b/>
-                <w:bCs/>
-              </w:rPr>
-            </w:pPr>
-            <w:r>
-              <w:rPr>
-                <w:b/>
-                <w:bCs/>
-              </w:rPr>
-              <w:t>[AMOUNT]</w:t>
-            </w:r>
-            <w:r>
-              <w:rPr>
-                <w:b/>
-                <w:bCs/>
-              </w:rPr>
-              <w:t xml:space="preserve"> </w:t>
-            </w:r>
-          </w:p>
-        </w:tc>
-      </w:tr>
-      <w:tr>
-        <w:trPr>
-          <w:tblCellSpacing w:w="15" w:type="dxa"/>
-        </w:trPr>
-        <w:tc>
-          <w:tcPr>
-            <w:tcW w:w="1919" w:type="dxa"/>
-            <w:vAlign w:val="center"/>
-            <w:hideMark/>
-          </w:tcPr>
-          <w:p>
-            <w:r>
-              <w:t>Short / (Over)</w:t>
-            </w:r>
-          </w:p>
-        </w:tc>
-        <w:tc>
-          <w:tcPr>
-            <w:tcW w:w="0" w:type="auto"/>
-            <w:vAlign w:val="center"/>
-            <w:hideMark/>
-          </w:tcPr>
-          <w:p>
-            <w:pPr>
-              <w:rPr>
-                <w:b/>
-                <w:bCs/>
-              </w:rPr>
-            </w:pPr>
-            <w:r>
-              <w:rPr>
-                <w:b/>
-                <w:bCs/>
-                <w:color w:val="EE0000"/>
-              </w:rPr>
-              <w:t>[AMOUNT]</w:t>
-            </w:r>
-          </w:p>
-        </w:tc>
-      </w:tr>
-    </w:tbl>
-    <w:p>
       <w:r>
         <w:pict w14:anchorId="2E233703">
           <v:rect id="_x0000_i1028" style="width:0;height:1.5pt" o:hrstd="t" o:hr="t" fillcolor="#a0a0a0" stroked="f"/>
@@ -575,7 +331,14 @@
           <w:b/>
           <w:bCs/>
         </w:rPr>
-        <w:t>5. DETAILED</w:t>
+        <w:t>4</w:t>
+      </w:r>
+      <w:r>
+        <w:rPr>
+          <w:b/>
+          <w:bCs/>
+        </w:rPr>
+        <w:t>. DETAILED</w:t>
       </w:r>
       <w:r>
         <w:rPr>
@@ -604,7 +367,28 @@
           <w:b/>
           <w:bCs/>
         </w:rPr>
-        <w:t>Missing / Incomplete Attachments</w:t>
+        <w:t xml:space="preserve">Missing </w:t>
+      </w:r>
+      <w:r>
+        <w:rPr>
+          <w:b/>
+          <w:bCs/>
+        </w:rPr>
+        <w:t>PCV, Attachments</w:t>
+      </w:r>
+      <w:r>
+        <w:rPr>
+          <w:b/>
+          <w:bCs/>
+        </w:rPr>
+        <w:t>/ Incomplete Attachments</w:t>
+      </w:r>
+      <w:r>
+        <w:rPr>
+          <w:b/>
+          <w:bCs/>
+        </w:rPr>
+        <w:t>/ No PCV Supported</w:t>
       </w:r>
     </w:p>
     <w:p>
@@ -618,31 +402,10 @@
         <w:t>Some PCVs were noted without official receipts or supporting documents</w:t>
       </w:r>
       <w:r>
-        <w:t xml:space="preserve"> covering the period of </w:t>
-      </w:r>
-      <w:r>
-        <w:t>[Month</w:t>
-      </w:r>
-      <w:r>
         <w:t xml:space="preserve"> </w:t>
       </w:r>
       <w:r>
-        <w:t>Day</w:t>
-      </w:r>
-      <w:r>
-        <w:t>,</w:t>
-      </w:r>
-      <w:r>
-        <w:t xml:space="preserve"> Year]</w:t>
-      </w:r>
-      <w:r>
-        <w:t xml:space="preserve"> </w:t>
-      </w:r>
-      <w:r>
-        <w:t xml:space="preserve">– </w:t>
-      </w:r>
-      <w:r>
-        <w:t>[Month Day, Year]</w:t>
+        <w:t>[GET DATA FROM THE PCA RECORDS]</w:t>
       </w:r>
     </w:p>
     <w:p>
@@ -702,13 +465,40 @@
         <w:t xml:space="preserve"> </w:t>
       </w:r>
       <w:r>
-        <w:t xml:space="preserve">[Month Day, Year] </w:t>
+        <w:t>[</w:t>
+      </w:r>
+      <w:r>
+        <w:rPr>
+          <w:i/>
+          <w:iCs/>
+        </w:rPr>
+        <w:t>Month Day, Year (Italic style)</w:t>
+      </w:r>
+      <w:r>
+        <w:t xml:space="preserve">] </w:t>
       </w:r>
       <w:r>
         <w:t xml:space="preserve">– </w:t>
       </w:r>
       <w:r>
-        <w:t xml:space="preserve">[Month Day, Year] </w:t>
+        <w:t>[</w:t>
+      </w:r>
+      <w:r>
+        <w:rPr>
+          <w:i/>
+          <w:iCs/>
+        </w:rPr>
+        <w:t>Month Day, Year (Italic style</w:t>
+      </w:r>
+      <w:r>
+        <w:rPr>
+          <w:i/>
+          <w:iCs/>
+        </w:rPr>
+        <w:t>)</w:t>
+      </w:r>
+      <w:r>
+        <w:t xml:space="preserve">] </w:t>
       </w:r>
       <w:r>
         <w:t>exactly</w:t>
@@ -723,7 +513,25 @@
         <w:t xml:space="preserve"> </w:t>
       </w:r>
       <w:r>
-        <w:t>[AMOUNT].</w:t>
+        <w:rPr>
+          <w:b/>
+          <w:bCs/>
+        </w:rPr>
+        <w:t>[AMOUNT</w:t>
+      </w:r>
+      <w:r>
+        <w:rPr>
+          <w:b/>
+          <w:bCs/>
+        </w:rPr>
+        <w:t xml:space="preserve"> (Bold font)</w:t>
+      </w:r>
+      <w:r>
+        <w:rPr>
+          <w:b/>
+          <w:bCs/>
+        </w:rPr>
+        <w:t>].</w:t>
       </w:r>
     </w:p>
     <w:p>
@@ -739,31 +547,58 @@
         <w:t>Beyond the allowed period</w:t>
       </w:r>
       <w:r>
-        <w:t xml:space="preserve"> [Month Day, Year]</w:t>
-      </w:r>
-      <w:r>
-        <w:t xml:space="preserve"> – </w:t>
-      </w:r>
-      <w:r>
-        <w:t>[Month Day, Year]</w:t>
-      </w:r>
-      <w:r>
         <w:t xml:space="preserve"> </w:t>
       </w:r>
       <w:r>
-        <w:t>exactly</w:t>
+        <w:t>[</w:t>
+      </w:r>
+      <w:r>
+        <w:rPr>
+          <w:i/>
+          <w:iCs/>
+        </w:rPr>
+        <w:t>Month Day, Year (Italic style)</w:t>
+      </w:r>
+      <w:r>
+        <w:t xml:space="preserve">] </w:t>
+      </w:r>
+      <w:r>
+        <w:t xml:space="preserve">– </w:t>
+      </w:r>
+      <w:r>
+        <w:t>[</w:t>
+      </w:r>
+      <w:r>
+        <w:rPr>
+          <w:i/>
+          <w:iCs/>
+        </w:rPr>
+        <w:t>Month Day, Year (Italic style)</w:t>
+      </w:r>
+      <w:r>
+        <w:t>]</w:t>
       </w:r>
       <w:r>
         <w:t xml:space="preserve"> </w:t>
       </w:r>
       <w:r>
+        <w:t xml:space="preserve">exactly </w:t>
+      </w:r>
+      <w:r>
         <w:t>PHP</w:t>
       </w:r>
       <w:r>
         <w:t xml:space="preserve"> </w:t>
       </w:r>
       <w:r>
-        <w:t>[AMOUNT].</w:t>
+        <w:rPr>
+          <w:b/>
+          <w:bCs/>
+        </w:rPr>
+        <w:t>[AMOUNT (Bold font)]</w:t>
+      </w:r>
+      <w:r>
+        <w:t>.</w:t>
       </w:r>
     </w:p>
     <w:p>
@@ -792,16 +627,38 @@
         <w:t xml:space="preserve">A cash </w:t>
       </w:r>
       <w:r>
-        <w:t>[SHORTAGE/OVERAGE/</w:t>
-      </w:r>
-      <w:r>
-        <w:rPr>
-          <w:i/>
-          <w:iCs/>
-        </w:rPr>
-        <w:t>N/A</w:t>
-      </w:r>
-      <w:r>
+        <w:rPr>
+          <w:b/>
+          <w:bCs/>
+        </w:rPr>
+        <w:t>[SHORTAGE/OVERAGE</w:t>
+      </w:r>
+      <w:r>
+        <w:rPr>
+          <w:b/>
+          <w:bCs/>
+        </w:rPr>
+        <w:t xml:space="preserve"> </w:t>
+      </w:r>
+      <w:r>
+        <w:rPr>
+          <w:b/>
+          <w:bCs/>
+        </w:rPr>
+        <w:t>v</w:t>
+      </w:r>
+      <w:r>
+        <w:rPr>
+          <w:b/>
+          <w:bCs/>
+        </w:rPr>
+        <w:t>alue from the lowest bottom section of the Tally Summary</w:t>
+      </w:r>
+      <w:r>
+        <w:rPr>
+          <w:b/>
+          <w:bCs/>
+        </w:rPr>
         <w:t>]</w:t>
       </w:r>
       <w:r>
@@ -811,12 +668,31 @@
         <w:t xml:space="preserve">PHP </w:t>
       </w:r>
       <w:r>
-        <w:t>[AMOUNT</w:t>
-      </w:r>
-      <w:r>
-        <w:t>, BOLD</w:t>
-      </w:r>
-      <w:r>
+        <w:rPr>
+          <w:b/>
+          <w:bCs/>
+        </w:rPr>
+        <w:t>[</w:t>
+      </w:r>
+      <w:r>
+        <w:rPr>
+          <w:b/>
+          <w:bCs/>
+        </w:rPr>
+        <w:t xml:space="preserve">Amount </w:t>
+      </w:r>
+      <w:r>
+        <w:rPr>
+          <w:b/>
+          <w:bCs/>
+        </w:rPr>
+        <w:t>value from the lowest bottom section of the Tally Summary</w:t>
+      </w:r>
+      <w:r>
+        <w:rPr>
+          <w:b/>
+          <w:bCs/>
+        </w:rPr>
         <w:t>]</w:t>
       </w:r>
       <w:r>
@@ -854,23 +730,11 @@
           <w:ilvl w:val="1"/>
           <w:numId w:val="4"/>
         </w:numPr>
-        <w:rPr>
-          <w:i/>
-          <w:iCs/>
-        </w:rPr>
-      </w:pPr>
-      <w:r>
-        <w:rPr>
-          <w:i/>
-          <w:iCs/>
-        </w:rPr>
-        <w:t>N/A</w:t>
-      </w:r>
-      <w:r>
-        <w:rPr>
-          <w:i/>
-          <w:iCs/>
-        </w:rPr>
+      </w:pPr>
+      <w:r>
+        <w:t>[GET DATA FROM THE PCA RECORDS]</w:t>
+      </w:r>
+      <w:r>
         <w:br/>
       </w:r>
     </w:p>
@@ -934,17 +798,9 @@
           <w:ilvl w:val="1"/>
           <w:numId w:val="4"/>
         </w:numPr>
-        <w:rPr>
-          <w:i/>
-          <w:iCs/>
-        </w:rPr>
-      </w:pPr>
-      <w:r>
-        <w:rPr>
-          <w:i/>
-          <w:iCs/>
-        </w:rPr>
-        <w:t>N/A</w:t>
+      </w:pPr>
+      <w:r>
+        <w:t>[GET DATA FROM THE PCA RECORDS]</w:t>
       </w:r>
     </w:p>
     <w:p>
@@ -952,7 +808,6 @@
         <w:ind w:left="1440"/>
       </w:pPr>
       <w:r>
-        <w:lastRenderedPageBreak/>
         <w:pict w14:anchorId="18022EAE">
           <v:rect id="_x0000_i1029" style="width:0;height:1.5pt" o:hrstd="t" o:hr="t" fillcolor="#a0a0a0" stroked="f"/>
         </w:pict>
@@ -973,7 +828,14 @@
           <w:b/>
           <w:bCs/>
         </w:rPr>
-        <w:t>6. RECOMMENDATIONS</w:t>
+        <w:t>5</w:t>
+      </w:r>
+      <w:r>
+        <w:rPr>
+          <w:b/>
+          <w:bCs/>
+        </w:rPr>
+        <w:t>. RECOMMENDATIONS</w:t>
       </w:r>
     </w:p>
     <w:p>
@@ -1009,6 +871,7 @@
         </w:numPr>
       </w:pPr>
       <w:r>
+        <w:lastRenderedPageBreak/>
         <w:t>All unli</w:t>
       </w:r>
       <w:r>
@@ -1087,6 +950,7 @@
     </w:p>
     <w:p>
       <w:pPr>
+        <w:jc w:val="center"/>
         <w:rPr>
           <w:b/>
           <w:bCs/>
@@ -1340,6 +1204,69 @@
         <w:szCs w:val="20"/>
       </w:rPr>
       <w:instrText xml:space="preserve"> INCLUDEPICTURE  "https://gsdcph-my.sharepoint.com/personal/kjadeva_gsdc_com_ph/Documents/GSDC_BPM/GSDC_LOGO.png" \* MERGEFORMATINET </w:instrText>
+    </w:r>
+    <w:r>
+      <w:rPr>
+        <w:rFonts w:cs="Arial"/>
+        <w:szCs w:val="20"/>
+      </w:rPr>
+      <w:fldChar w:fldCharType="separate"/>
+    </w:r>
+    <w:r>
+      <w:rPr>
+        <w:rFonts w:cs="Arial"/>
+        <w:szCs w:val="20"/>
+      </w:rPr>
+      <w:fldChar w:fldCharType="begin"/>
+    </w:r>
+    <w:r>
+      <w:rPr>
+        <w:rFonts w:cs="Arial"/>
+        <w:szCs w:val="20"/>
+      </w:rPr>
+      <w:instrText xml:space="preserve"> INCLUDEPICTURE  "C:\\..\\GSDC_BPM\\GSDC_LOGO.png" \* MERGEFORMATINET </w:instrText>
+    </w:r>
+    <w:r>
+      <w:rPr>
+        <w:rFonts w:cs="Arial"/>
+        <w:szCs w:val="20"/>
+      </w:rPr>
+      <w:fldChar w:fldCharType="separate"/>
+    </w:r>
+    <w:r>
+      <w:rPr>
+        <w:rFonts w:cs="Arial"/>
+        <w:szCs w:val="20"/>
+      </w:rPr>
+      <w:fldChar w:fldCharType="begin"/>
+    </w:r>
+    <w:r>
+      <w:rPr>
+        <w:rFonts w:cs="Arial"/>
+        <w:szCs w:val="20"/>
+      </w:rPr>
+      <w:instrText xml:space="preserve"> INCLUDEPICTURE  "C:\\..\\GSDC_BPM\\GSDC_LOGO.png" \* MERGEFORMATINET </w:instrText>
+    </w:r>
+    <w:r>
+      <w:rPr>
+        <w:rFonts w:cs="Arial"/>
+        <w:szCs w:val="20"/>
+      </w:rPr>
+      <w:fldChar w:fldCharType="separate"/>
+    </w:r>
+    <w:r>
+      <w:rPr>
+        <w:rFonts w:cs="Arial"/>
+        <w:szCs w:val="20"/>
+      </w:rPr>
+      <w:fldChar w:fldCharType="begin"/>
+    </w:r>
+    <w:r>
+      <w:rPr>
+        <w:rFonts w:cs="Arial"/>
+        <w:szCs w:val="20"/>
+      </w:rPr>
+      <w:instrText xml:space="preserve"> INCLUDEPICTURE  "C:\\..\\GSDC_BPM\\GSDC_LOGO.png" \* MERGEFORMATINET </w:instrText>
     </w:r>
     <w:r>
       <w:rPr>
@@ -1440,6 +1367,27 @@
           <v:imagedata r:id="rId1" r:href="rId2"/>
         </v:shape>
       </w:pict>
+    </w:r>
+    <w:r>
+      <w:rPr>
+        <w:rFonts w:cs="Arial"/>
+        <w:szCs w:val="20"/>
+      </w:rPr>
+      <w:fldChar w:fldCharType="end"/>
+    </w:r>
+    <w:r>
+      <w:rPr>
+        <w:rFonts w:cs="Arial"/>
+        <w:szCs w:val="20"/>
+      </w:rPr>
+      <w:fldChar w:fldCharType="end"/>
+    </w:r>
+    <w:r>
+      <w:rPr>
+        <w:rFonts w:cs="Arial"/>
+        <w:szCs w:val="20"/>
+      </w:rPr>
+      <w:fldChar w:fldCharType="end"/>
     </w:r>
     <w:r>
       <w:rPr>

</xml_diff>